<commit_message>
week 4 relational algebra unsure answer correctness
</commit_message>
<xml_diff>
--- a/Applied/App04/FIT2094 Applied 4-1 The Relational Model.docx
+++ b/Applied/App04/FIT2094 Applied 4-1 The Relational Model.docx
@@ -164,6 +164,14 @@
         </w:rPr>
         <w:t>Relation</w:t>
       </w:r>
+      <w:r>
+        <w:rPr>
+          <w:rFonts w:ascii="Open Sans" w:hAnsi="Open Sans" w:cs="Open Sans"/>
+          <w:sz w:val="19"/>
+          <w:szCs w:val="19"/>
+        </w:rPr>
+        <w:t xml:space="preserve"> / Entity (Design) / Table </w:t>
+      </w:r>
     </w:p>
     <w:p>
       <w:pPr>
@@ -997,6 +1005,7 @@
           <w:szCs w:val="19"/>
         </w:rPr>
       </w:pPr>
+      <w:bookmarkStart w:id="0" w:name="OLE_LINK1"/>
       <w:r>
         <w:rPr>
           <w:rFonts w:ascii="Open Sans" w:hAnsi="Open Sans" w:cs="Open Sans"/>
@@ -1064,6 +1073,7 @@
         <w:t>. This means that all the attributes together make the only candidate key. Since there is only one candidate key, the four attributes that make up the candidate key are the primary key</w:t>
       </w:r>
     </w:p>
+    <w:bookmarkEnd w:id="0"/>
     <w:p>
       <w:pPr>
         <w:pStyle w:val="amber-el"/>
@@ -1121,7 +1131,7 @@
           <w:sz w:val="19"/>
           <w:szCs w:val="19"/>
         </w:rPr>
-        <w:t xml:space="preserve">ORDERLINE (order_id, </w:t>
+        <w:t>ORDERLINE (</w:t>
       </w:r>
       <w:proofErr w:type="spellStart"/>
       <w:r>
@@ -1132,6 +1142,28 @@
           <w:sz w:val="19"/>
           <w:szCs w:val="19"/>
         </w:rPr>
+        <w:t>order_id</w:t>
+      </w:r>
+      <w:proofErr w:type="spellEnd"/>
+      <w:r>
+        <w:rPr>
+          <w:rFonts w:ascii="Open Sans" w:hAnsi="Open Sans" w:cs="Open Sans"/>
+          <w:b/>
+          <w:bCs/>
+          <w:sz w:val="19"/>
+          <w:szCs w:val="19"/>
+        </w:rPr>
+        <w:t xml:space="preserve">, </w:t>
+      </w:r>
+      <w:proofErr w:type="spellStart"/>
+      <w:r>
+        <w:rPr>
+          <w:rFonts w:ascii="Open Sans" w:hAnsi="Open Sans" w:cs="Open Sans"/>
+          <w:b/>
+          <w:bCs/>
+          <w:sz w:val="19"/>
+          <w:szCs w:val="19"/>
+        </w:rPr>
         <w:t>prod_no</w:t>
       </w:r>
       <w:proofErr w:type="spellEnd"/>
@@ -1377,23 +1409,7 @@
           <w:sz w:val="19"/>
           <w:szCs w:val="19"/>
         </w:rPr>
-        <w:t>Primary key:</w:t>
-      </w:r>
-      <w:r>
-        <w:rPr>
-          <w:rFonts w:ascii="Open Sans" w:hAnsi="Open Sans" w:cs="Open Sans"/>
-          <w:sz w:val="19"/>
-          <w:szCs w:val="19"/>
-        </w:rPr>
-        <w:t xml:space="preserve"> composite key (</w:t>
-      </w:r>
-      <w:r>
-        <w:rPr>
-          <w:rFonts w:ascii="Open Sans" w:hAnsi="Open Sans" w:cs="Open Sans"/>
-          <w:sz w:val="19"/>
-          <w:szCs w:val="19"/>
-        </w:rPr>
-        <w:t xml:space="preserve">order_id, </w:t>
+        <w:t>Primary key: composite key (</w:t>
       </w:r>
       <w:proofErr w:type="spellStart"/>
       <w:r>
@@ -1402,15 +1418,7 @@
           <w:sz w:val="19"/>
           <w:szCs w:val="19"/>
         </w:rPr>
-        <w:t>prod_</w:t>
-      </w:r>
-      <w:r>
-        <w:rPr>
-          <w:rFonts w:ascii="Open Sans" w:hAnsi="Open Sans" w:cs="Open Sans"/>
-          <w:sz w:val="19"/>
-          <w:szCs w:val="19"/>
-        </w:rPr>
-        <w:t>no</w:t>
+        <w:t>order_id</w:t>
       </w:r>
       <w:proofErr w:type="spellEnd"/>
       <w:r>
@@ -1419,6 +1427,24 @@
           <w:sz w:val="19"/>
           <w:szCs w:val="19"/>
         </w:rPr>
+        <w:t xml:space="preserve">, </w:t>
+      </w:r>
+      <w:proofErr w:type="spellStart"/>
+      <w:r>
+        <w:rPr>
+          <w:rFonts w:ascii="Open Sans" w:hAnsi="Open Sans" w:cs="Open Sans"/>
+          <w:sz w:val="19"/>
+          <w:szCs w:val="19"/>
+        </w:rPr>
+        <w:t>prod_no</w:t>
+      </w:r>
+      <w:proofErr w:type="spellEnd"/>
+      <w:r>
+        <w:rPr>
+          <w:rFonts w:ascii="Open Sans" w:hAnsi="Open Sans" w:cs="Open Sans"/>
+          <w:sz w:val="19"/>
+          <w:szCs w:val="19"/>
+        </w:rPr>
         <w:t>)</w:t>
       </w:r>
     </w:p>
@@ -1438,15 +1464,7 @@
           <w:sz w:val="19"/>
           <w:szCs w:val="19"/>
         </w:rPr>
-        <w:t xml:space="preserve">Foreign key: </w:t>
-      </w:r>
-      <w:r>
-        <w:rPr>
-          <w:rFonts w:ascii="Open Sans" w:hAnsi="Open Sans" w:cs="Open Sans"/>
-          <w:sz w:val="19"/>
-          <w:szCs w:val="19"/>
-        </w:rPr>
-        <w:t xml:space="preserve"> order_id, </w:t>
+        <w:t xml:space="preserve">Foreign key:  </w:t>
       </w:r>
       <w:proofErr w:type="spellStart"/>
       <w:r>
@@ -1455,6 +1473,24 @@
           <w:sz w:val="19"/>
           <w:szCs w:val="19"/>
         </w:rPr>
+        <w:t>order_id</w:t>
+      </w:r>
+      <w:proofErr w:type="spellEnd"/>
+      <w:r>
+        <w:rPr>
+          <w:rFonts w:ascii="Open Sans" w:hAnsi="Open Sans" w:cs="Open Sans"/>
+          <w:sz w:val="19"/>
+          <w:szCs w:val="19"/>
+        </w:rPr>
+        <w:t xml:space="preserve">, </w:t>
+      </w:r>
+      <w:proofErr w:type="spellStart"/>
+      <w:r>
+        <w:rPr>
+          <w:rFonts w:ascii="Open Sans" w:hAnsi="Open Sans" w:cs="Open Sans"/>
+          <w:sz w:val="19"/>
+          <w:szCs w:val="19"/>
+        </w:rPr>
         <w:t>prod_no</w:t>
       </w:r>
       <w:proofErr w:type="spellEnd"/>
@@ -1498,15 +1534,7 @@
           <w:sz w:val="19"/>
           <w:szCs w:val="19"/>
         </w:rPr>
-        <w:t>Primary key:</w:t>
-      </w:r>
-      <w:r>
-        <w:rPr>
-          <w:rFonts w:ascii="Open Sans" w:hAnsi="Open Sans" w:cs="Open Sans"/>
-          <w:sz w:val="19"/>
-          <w:szCs w:val="19"/>
-        </w:rPr>
-        <w:t xml:space="preserve"> </w:t>
+        <w:t xml:space="preserve">Primary key: </w:t>
       </w:r>
       <w:proofErr w:type="spellStart"/>
       <w:r>
@@ -1535,15 +1563,7 @@
           <w:sz w:val="19"/>
           <w:szCs w:val="19"/>
         </w:rPr>
-        <w:t xml:space="preserve">Foreign key: </w:t>
-      </w:r>
-      <w:r>
-        <w:rPr>
-          <w:rFonts w:ascii="Open Sans" w:hAnsi="Open Sans" w:cs="Open Sans"/>
-          <w:sz w:val="19"/>
-          <w:szCs w:val="19"/>
-        </w:rPr>
-        <w:t xml:space="preserve"> no foreign key</w:t>
+        <w:t>Foreign key:  no foreign key</w:t>
       </w:r>
     </w:p>
     <w:p>

</xml_diff>